<commit_message>
Cuentas de participante con correo y contraseña: registro, ingresar, recuperar y proteger cuenta
Co-Authored-By: Claude Opus 5.5 <noreply@anthropic.com>
</commit_message>
<xml_diff>
--- a/docs/Declaracion_Uso_IA_Borrador.docx
+++ b/docs/Declaracion_Uso_IA_Borrador.docx
@@ -2546,6 +2546,110 @@
                 <w:sz w:val="22"/>
                 <w:szCs w:val="22"/>
               </w:rPr>
+              <w:t xml:space="preserve">Cuentas con contraseña</w:t>
+            </w:r>
+          </w:p>
+        </w:tc>
+        <w:tc>
+          <w:tcPr>
+            <w:tcW w:type="dxa" w:w="4187"/>
+            <w:tcBorders>
+              <w:top w:val="single" w:color="D0D0D0" w:sz="2"/>
+              <w:left w:val="single" w:color="D0D0D0" w:sz="2"/>
+              <w:bottom w:val="single" w:color="D0D0D0" w:sz="2"/>
+              <w:right w:val="single" w:color="D0D0D0" w:sz="2"/>
+            </w:tcBorders>
+            <w:tcMar>
+              <w:top w:type="dxa" w:w="70"/>
+              <w:left w:type="dxa" w:w="100"/>
+              <w:bottom w:type="dxa" w:w="70"/>
+              <w:right w:type="dxa" w:w="100"/>
+            </w:tcMar>
+            <w:vAlign w:val="center"/>
+          </w:tcPr>
+          <w:p>
+            <w:pPr>
+              <w:spacing w:after="0" w:line="252"/>
+            </w:pPr>
+            <w:r>
+              <w:rPr>
+                <w:rFonts w:ascii="Montserrat" w:cs="Montserrat" w:eastAsia="Montserrat" w:hAnsi="Montserrat"/>
+                <w:color w:val="1A1A1A"/>
+                <w:sz w:val="22"/>
+                <w:szCs w:val="22"/>
+              </w:rPr>
+              <w:t xml:space="preserve">Registro con correo y contraseña, pantalla Ingresar, recuperación de contraseña, conversión de registros antiguos conservando su id y función borrar_mi_cuenta (0004); probado con dos dispositivos simulados</w:t>
+            </w:r>
+          </w:p>
+        </w:tc>
+        <w:tc>
+          <w:tcPr>
+            <w:tcW w:type="dxa" w:w="3203"/>
+            <w:tcBorders>
+              <w:top w:val="single" w:color="D0D0D0" w:sz="2"/>
+              <w:left w:val="single" w:color="D0D0D0" w:sz="2"/>
+              <w:bottom w:val="single" w:color="D0D0D0" w:sz="2"/>
+              <w:right w:val="single" w:color="D0D0D0" w:sz="2"/>
+            </w:tcBorders>
+            <w:tcMar>
+              <w:top w:type="dxa" w:w="70"/>
+              <w:left w:type="dxa" w:w="100"/>
+              <w:bottom w:type="dxa" w:w="70"/>
+              <w:right w:type="dxa" w:w="100"/>
+            </w:tcMar>
+            <w:vAlign w:val="center"/>
+          </w:tcPr>
+          <w:p>
+            <w:pPr>
+              <w:spacing w:after="0" w:line="252"/>
+            </w:pPr>
+            <w:r>
+              <w:rPr>
+                <w:rFonts w:ascii="Montserrat" w:cs="Montserrat" w:eastAsia="Montserrat" w:hAnsi="Montserrat"/>
+                <w:color w:val="1A1A1A"/>
+                <w:sz w:val="22"/>
+                <w:szCs w:val="22"/>
+              </w:rPr>
+              <w:t xml:space="preserve">Detectó el problema, desactivó Confirm email y autorizó cuentas de prueba con su correo</w:t>
+            </w:r>
+          </w:p>
+        </w:tc>
+      </w:tr>
+      <w:tr>
+        <w:trPr>
+          <w:cantSplit/>
+        </w:trPr>
+        <w:tc>
+          <w:tcPr>
+            <w:tcW w:type="dxa" w:w="1970"/>
+            <w:tcBorders>
+              <w:top w:val="single" w:color="D0D0D0" w:sz="2"/>
+              <w:left w:val="single" w:color="D0D0D0" w:sz="2"/>
+              <w:bottom w:val="single" w:color="D0D0D0" w:sz="2"/>
+              <w:right w:val="single" w:color="D0D0D0" w:sz="2"/>
+            </w:tcBorders>
+            <w:shd w:fill="F2F2F2" w:color="auto" w:val="clear"/>
+            <w:tcMar>
+              <w:top w:type="dxa" w:w="70"/>
+              <w:left w:type="dxa" w:w="100"/>
+              <w:bottom w:type="dxa" w:w="70"/>
+              <w:right w:type="dxa" w:w="100"/>
+            </w:tcMar>
+            <w:vAlign w:val="center"/>
+          </w:tcPr>
+          <w:p>
+            <w:pPr>
+              <w:spacing w:after="0" w:line="252"/>
+            </w:pPr>
+            <w:r>
+              <w:rPr>
+                <w:rFonts w:ascii="Montserrat" w:cs="Montserrat" w:eastAsia="Montserrat" w:hAnsi="Montserrat"/>
+                <w:b/>
+                <w:bCs/>
+                <w:color w:val="1A1A1A"/>
+                <w:sz w:val="22"/>
+                <w:szCs w:val="22"/>
+              </w:rPr>
               <w:t xml:space="preserve">6. Documentación</w:t>
             </w:r>
           </w:p>
@@ -2559,6 +2663,7 @@
               <w:bottom w:val="single" w:color="D0D0D0" w:sz="2"/>
               <w:right w:val="single" w:color="D0D0D0" w:sz="2"/>
             </w:tcBorders>
+            <w:shd w:fill="F2F2F2" w:color="auto" w:val="clear"/>
             <w:tcMar>
               <w:top w:type="dxa" w:w="70"/>
               <w:left w:type="dxa" w:w="100"/>
@@ -2591,6 +2696,7 @@
               <w:bottom w:val="single" w:color="D0D0D0" w:sz="2"/>
               <w:right w:val="single" w:color="D0D0D0" w:sz="2"/>
             </w:tcBorders>
+            <w:shd w:fill="F2F2F2" w:color="auto" w:val="clear"/>
             <w:tcMar>
               <w:top w:type="dxa" w:w="70"/>
               <w:left w:type="dxa" w:w="100"/>

</xml_diff>